<commit_message>
Atualiza relatorio para v2.0 com correcoes tecnicas
</commit_message>
<xml_diff>
--- a/Projeto Gym Manager/docs/GymManager_Relatorio_Final.docx
+++ b/Projeto Gym Manager/docs/GymManager_Relatorio_Final.docx
@@ -337,7 +337,7 @@
                 <w:sz w:val="48"/>
                 <w:szCs w:val="48"/>
               </w:rPr>
-              <w:t xml:space="preserve">9</w:t>
+              <w:t xml:space="preserve">6</w:t>
             </w:r>
           </w:p>
           <w:p>
@@ -43457,7 +43457,1981 @@
           <w:sz w:val="34"/>
           <w:szCs w:val="34"/>
         </w:rPr>
-        <w:t xml:space="preserve">18. Estrutura do Projeto</w:t>
+        <w:t xml:space="preserve">18. Correções Técnicas — Versão 2.0</w:t>
+      </w:r>
+    </w:p>
+    <w:p>
+      <w:pPr>
+        <w:spacing w:after="100" w:before="60"/>
+      </w:pPr>
+      <w:r>
+        <w:rPr>
+          <w:rFonts w:ascii="Arial" w:cs="Arial" w:eastAsia="Arial" w:hAnsi="Arial"/>
+          <w:color w:val="1A202C"/>
+          <w:sz w:val="22"/>
+          <w:szCs w:val="22"/>
+        </w:rPr>
+        <w:t xml:space="preserve">Após revisão interna do projeto, foram identificados e corrigidos 6 pontos técnicos. Todas as correções estão implementadas no arquivo master.sql disponível no repositório GitHub.</w:t>
+      </w:r>
+    </w:p>
+    <w:p>
+      <w:pPr>
+        <w:spacing w:after="0" w:before="100"/>
+      </w:pPr>
+      <w:r>
+        <w:t xml:space="preserve"/>
+      </w:r>
+    </w:p>
+    <w:tbl>
+      <w:tblPr>
+        <w:tblW w:type="dxa" w:w="9200"/>
+        <w:tblBorders>
+          <w:top w:val="single" w:color="auto" w:sz="4"/>
+          <w:left w:val="single" w:color="auto" w:sz="4"/>
+          <w:bottom w:val="single" w:color="auto" w:sz="4"/>
+          <w:right w:val="single" w:color="auto" w:sz="4"/>
+          <w:insideH w:val="single" w:color="auto" w:sz="4"/>
+          <w:insideV w:val="single" w:color="auto" w:sz="4"/>
+        </w:tblBorders>
+      </w:tblPr>
+      <w:tblGrid>
+        <w:gridCol w:w="9200"/>
+      </w:tblGrid>
+      <w:tr>
+        <w:tc>
+          <w:tcPr>
+            <w:tcBorders>
+              <w:top w:val="single" w:color="1E6091" w:sz="8"/>
+              <w:left w:val="single" w:color="1E6091" w:sz="24"/>
+              <w:bottom w:val="single" w:color="1E6091" w:sz="8"/>
+              <w:right w:val="single" w:color="D5D8DC" w:sz="4"/>
+            </w:tcBorders>
+            <w:shd w:fill="E8F8FC" w:val="clear"/>
+            <w:tcMar>
+              <w:top w:type="dxa" w:w="160"/>
+              <w:left w:type="dxa" w:w="240"/>
+              <w:bottom w:type="dxa" w:w="160"/>
+              <w:right w:type="dxa" w:w="240"/>
+            </w:tcMar>
+          </w:tcPr>
+          <w:p>
+            <w:r>
+              <w:rPr>
+                <w:rFonts w:ascii="Arial" w:cs="Arial" w:eastAsia="Arial" w:hAnsi="Arial"/>
+                <w:b/>
+                <w:bCs/>
+                <w:color w:val="1A3A5C"/>
+                <w:sz w:val="22"/>
+                <w:szCs w:val="22"/>
+              </w:rPr>
+              <w:t xml:space="preserve">Histórico de Versões</w:t>
+            </w:r>
+          </w:p>
+          <w:p>
+            <w:pPr>
+              <w:spacing w:after="0" w:before="60"/>
+            </w:pPr>
+            <w:r>
+              <w:t xml:space="preserve"/>
+            </w:r>
+          </w:p>
+          <w:p>
+            <w:r>
+              <w:rPr>
+                <w:rFonts w:ascii="Arial" w:cs="Arial" w:eastAsia="Arial" w:hAnsi="Arial"/>
+                <w:color w:val="1A202C"/>
+                <w:sz w:val="20"/>
+                <w:szCs w:val="20"/>
+              </w:rPr>
+              <w:t xml:space="preserve">v1.0 — Jun/2024 — Entrega inicial: 13 tabelas, views, functions, procedures, triggers</w:t>
+            </w:r>
+          </w:p>
+          <w:p>
+            <w:pPr>
+              <w:spacing w:before="40"/>
+            </w:pPr>
+            <w:r>
+              <w:rPr>
+                <w:rFonts w:ascii="Arial" w:cs="Arial" w:eastAsia="Arial" w:hAnsi="Arial"/>
+                <w:color w:val="1A202C"/>
+                <w:sz w:val="20"/>
+                <w:szCs w:val="20"/>
+              </w:rPr>
+              <w:t xml:space="preserve">v2.0 — Jul/2024 — Correções técnicas: UNIQUE constraints, trigger de encerramento, DETERMINISTIC, validação de plano, master.sql unificado</w:t>
+            </w:r>
+          </w:p>
+        </w:tc>
+      </w:tr>
+    </w:tbl>
+    <w:p>
+      <w:pPr>
+        <w:spacing w:after="0" w:before="120"/>
+      </w:pPr>
+      <w:r>
+        <w:t xml:space="preserve"/>
+      </w:r>
+    </w:p>
+    <w:p>
+      <w:pPr>
+        <w:pStyle w:val="Heading2"/>
+        <w:spacing w:after="160" w:before="380"/>
+      </w:pPr>
+      <w:r>
+        <w:rPr>
+          <w:rFonts w:ascii="Arial" w:cs="Arial" w:eastAsia="Arial" w:hAnsi="Arial"/>
+          <w:b/>
+          <w:bCs/>
+          <w:color w:val="1E6091"/>
+          <w:sz w:val="26"/>
+          <w:szCs w:val="26"/>
+        </w:rPr>
+        <w:t xml:space="preserve">18.1 Correção 1 — UNIQUE em pagamento</w:t>
+      </w:r>
+    </w:p>
+    <w:tbl>
+      <w:tblPr>
+        <w:tblW w:type="dxa" w:w="9200"/>
+        <w:tblBorders>
+          <w:top w:val="single" w:color="auto" w:sz="4"/>
+          <w:left w:val="single" w:color="auto" w:sz="4"/>
+          <w:bottom w:val="single" w:color="auto" w:sz="4"/>
+          <w:right w:val="single" w:color="auto" w:sz="4"/>
+          <w:insideH w:val="single" w:color="auto" w:sz="4"/>
+          <w:insideV w:val="single" w:color="auto" w:sz="4"/>
+        </w:tblBorders>
+      </w:tblPr>
+      <w:tblGrid>
+        <w:gridCol w:w="9200"/>
+      </w:tblGrid>
+      <w:tr>
+        <w:tc>
+          <w:tcPr>
+            <w:tcBorders>
+              <w:top w:val="single" w:color="2D6A4F" w:sz="6"/>
+              <w:left w:val="single" w:color="2D6A4F" w:sz="6"/>
+              <w:bottom w:val="single" w:color="2D6A4F" w:sz="6"/>
+              <w:right w:val="single" w:color="2D6A4F" w:sz="6"/>
+            </w:tcBorders>
+            <w:shd w:fill="D8F3DC" w:val="clear"/>
+            <w:tcMar>
+              <w:top w:type="dxa" w:w="120"/>
+              <w:left w:type="dxa" w:w="180"/>
+              <w:bottom w:type="dxa" w:w="120"/>
+              <w:right w:type="dxa" w:w="180"/>
+            </w:tcMar>
+          </w:tcPr>
+          <w:p>
+            <w:r>
+              <w:rPr>
+                <w:rFonts w:ascii="Courier New" w:cs="Courier New" w:eastAsia="Courier New" w:hAnsi="Courier New"/>
+                <w:b/>
+                <w:bCs/>
+                <w:color w:val="1B4332"/>
+                <w:sz w:val="20"/>
+                <w:szCs w:val="20"/>
+              </w:rPr>
+              <w:t xml:space="preserve">UNIQUE KEY uq_pagamento_parcela (id_matricula, parcela_numero)</w:t>
+            </w:r>
+          </w:p>
+        </w:tc>
+      </w:tr>
+    </w:tbl>
+    <w:p>
+      <w:pPr>
+        <w:spacing w:after="0" w:before="80"/>
+      </w:pPr>
+      <w:r>
+        <w:t xml:space="preserve"/>
+      </w:r>
+    </w:p>
+    <w:p>
+      <w:pPr>
+        <w:spacing w:after="100" w:before="60"/>
+      </w:pPr>
+      <w:r>
+        <w:rPr>
+          <w:rFonts w:ascii="Arial" w:cs="Arial" w:eastAsia="Arial" w:hAnsi="Arial"/>
+          <w:color w:val="1A202C"/>
+          <w:sz w:val="22"/>
+          <w:szCs w:val="22"/>
+        </w:rPr>
+        <w:t xml:space="preserve">Problema: era possível inserir duas parcelas com o mesmo número para a mesma matrícula, gerando dados financeiros duplicados sem que o banco bloqueasse.</w:t>
+      </w:r>
+    </w:p>
+    <w:p>
+      <w:pPr>
+        <w:spacing w:after="100" w:before="60"/>
+      </w:pPr>
+      <w:r>
+        <w:rPr>
+          <w:rFonts w:ascii="Arial" w:cs="Arial" w:eastAsia="Arial" w:hAnsi="Arial"/>
+          <w:color w:val="1A202C"/>
+          <w:sz w:val="22"/>
+          <w:szCs w:val="22"/>
+        </w:rPr>
+        <w:t xml:space="preserve">Solução: adicionada constraint UNIQUE composta. Agora o banco rejeita automaticamente qualquer tentativa de duplicar uma parcela.</w:t>
+      </w:r>
+    </w:p>
+    <w:p>
+      <w:pPr>
+        <w:spacing w:after="0" w:before="80"/>
+      </w:pPr>
+      <w:r>
+        <w:t xml:space="preserve"/>
+      </w:r>
+    </w:p>
+    <w:tbl>
+      <w:tblPr>
+        <w:tblW w:type="dxa" w:w="9200"/>
+        <w:tblBorders>
+          <w:top w:val="single" w:color="auto" w:sz="4"/>
+          <w:left w:val="single" w:color="auto" w:sz="4"/>
+          <w:bottom w:val="single" w:color="auto" w:sz="4"/>
+          <w:right w:val="single" w:color="auto" w:sz="4"/>
+          <w:insideH w:val="single" w:color="auto" w:sz="4"/>
+          <w:insideV w:val="single" w:color="auto" w:sz="4"/>
+        </w:tblBorders>
+      </w:tblPr>
+      <w:tblGrid>
+        <w:gridCol w:w="9200"/>
+      </w:tblGrid>
+      <w:tr>
+        <w:tc>
+          <w:tcPr>
+            <w:tcBorders>
+              <w:top w:val="single" w:color="00B4D8" w:sz="8"/>
+              <w:left w:val="single" w:color="00B4D8" w:sz="24"/>
+              <w:bottom w:val="single" w:color="00B4D8" w:sz="8"/>
+              <w:right w:val="single" w:color="E2E8F0" w:sz="4"/>
+            </w:tcBorders>
+            <w:shd w:fill="0D1B2A" w:val="clear"/>
+            <w:tcMar>
+              <w:top w:type="dxa" w:w="140"/>
+              <w:left w:type="dxa" w:w="200"/>
+              <w:bottom w:type="dxa" w:w="140"/>
+              <w:right w:type="dxa" w:w="200"/>
+            </w:tcMar>
+          </w:tcPr>
+          <w:p>
+            <w:pPr>
+              <w:spacing w:after="0" w:before="0"/>
+            </w:pPr>
+            <w:r>
+              <w:rPr>
+                <w:rFonts w:ascii="Courier New" w:cs="Courier New" w:eastAsia="Courier New" w:hAnsi="Courier New"/>
+                <w:color w:val="90E0EF"/>
+                <w:sz w:val="17"/>
+                <w:szCs w:val="17"/>
+              </w:rPr>
+              <w:t xml:space="preserve">-- DEPOIS: UNIQUE impede parcela duplicada</w:t>
+            </w:r>
+          </w:p>
+          <w:p>
+            <w:pPr>
+              <w:spacing w:after="0" w:before="0"/>
+            </w:pPr>
+            <w:r>
+              <w:rPr>
+                <w:rFonts w:ascii="Courier New" w:cs="Courier New" w:eastAsia="Courier New" w:hAnsi="Courier New"/>
+                <w:color w:val="90E0EF"/>
+                <w:sz w:val="17"/>
+                <w:szCs w:val="17"/>
+              </w:rPr>
+              <w:t xml:space="preserve">UNIQUE KEY uq_pagamento_parcela (id_matricula, parcela_numero),</w:t>
+            </w:r>
+          </w:p>
+        </w:tc>
+      </w:tr>
+    </w:tbl>
+    <w:p>
+      <w:pPr>
+        <w:spacing w:after="0" w:before="120"/>
+      </w:pPr>
+      <w:r>
+        <w:t xml:space="preserve"/>
+      </w:r>
+    </w:p>
+    <w:p>
+      <w:pPr>
+        <w:pStyle w:val="Heading2"/>
+        <w:spacing w:after="160" w:before="380"/>
+      </w:pPr>
+      <w:r>
+        <w:rPr>
+          <w:rFonts w:ascii="Arial" w:cs="Arial" w:eastAsia="Arial" w:hAnsi="Arial"/>
+          <w:b/>
+          <w:bCs/>
+          <w:color w:val="1E6091"/>
+          <w:sz w:val="26"/>
+          <w:szCs w:val="26"/>
+        </w:rPr>
+        <w:t xml:space="preserve">18.2 Correção 2 — UNIQUE em aluno_modalidade</w:t>
+      </w:r>
+    </w:p>
+    <w:tbl>
+      <w:tblPr>
+        <w:tblW w:type="dxa" w:w="9200"/>
+        <w:tblBorders>
+          <w:top w:val="single" w:color="auto" w:sz="4"/>
+          <w:left w:val="single" w:color="auto" w:sz="4"/>
+          <w:bottom w:val="single" w:color="auto" w:sz="4"/>
+          <w:right w:val="single" w:color="auto" w:sz="4"/>
+          <w:insideH w:val="single" w:color="auto" w:sz="4"/>
+          <w:insideV w:val="single" w:color="auto" w:sz="4"/>
+        </w:tblBorders>
+      </w:tblPr>
+      <w:tblGrid>
+        <w:gridCol w:w="9200"/>
+      </w:tblGrid>
+      <w:tr>
+        <w:tc>
+          <w:tcPr>
+            <w:tcBorders>
+              <w:top w:val="single" w:color="2D6A4F" w:sz="6"/>
+              <w:left w:val="single" w:color="2D6A4F" w:sz="6"/>
+              <w:bottom w:val="single" w:color="2D6A4F" w:sz="6"/>
+              <w:right w:val="single" w:color="2D6A4F" w:sz="6"/>
+            </w:tcBorders>
+            <w:shd w:fill="D8F3DC" w:val="clear"/>
+            <w:tcMar>
+              <w:top w:type="dxa" w:w="120"/>
+              <w:left w:type="dxa" w:w="180"/>
+              <w:bottom w:type="dxa" w:w="120"/>
+              <w:right w:type="dxa" w:w="180"/>
+            </w:tcMar>
+          </w:tcPr>
+          <w:p>
+            <w:r>
+              <w:rPr>
+                <w:rFonts w:ascii="Courier New" w:cs="Courier New" w:eastAsia="Courier New" w:hAnsi="Courier New"/>
+                <w:b/>
+                <w:bCs/>
+                <w:color w:val="1B4332"/>
+                <w:sz w:val="20"/>
+                <w:szCs w:val="20"/>
+              </w:rPr>
+              <w:t xml:space="preserve">UNIQUE KEY uq_aluno_modalidade (id_aluno, id_modalidade)</w:t>
+            </w:r>
+          </w:p>
+        </w:tc>
+      </w:tr>
+    </w:tbl>
+    <w:p>
+      <w:pPr>
+        <w:spacing w:after="0" w:before="80"/>
+      </w:pPr>
+      <w:r>
+        <w:t xml:space="preserve"/>
+      </w:r>
+    </w:p>
+    <w:p>
+      <w:pPr>
+        <w:spacing w:after="100" w:before="60"/>
+      </w:pPr>
+      <w:r>
+        <w:rPr>
+          <w:rFonts w:ascii="Arial" w:cs="Arial" w:eastAsia="Arial" w:hAnsi="Arial"/>
+          <w:color w:val="1A202C"/>
+          <w:sz w:val="22"/>
+          <w:szCs w:val="22"/>
+        </w:rPr>
+        <w:t xml:space="preserve">Problema: era possível inserir o mesmo aluno na mesma modalidade múltiplas vezes, criando vínculos duplicados na tabela associativa.</w:t>
+      </w:r>
+    </w:p>
+    <w:p>
+      <w:pPr>
+        <w:spacing w:after="100" w:before="60"/>
+      </w:pPr>
+      <w:r>
+        <w:rPr>
+          <w:rFonts w:ascii="Arial" w:cs="Arial" w:eastAsia="Arial" w:hAnsi="Arial"/>
+          <w:color w:val="1A202C"/>
+          <w:sz w:val="22"/>
+          <w:szCs w:val="22"/>
+        </w:rPr>
+        <w:t xml:space="preserve">Solução: adicionada constraint UNIQUE composta. Um aluno só pode ter um vínculo por modalidade.</w:t>
+      </w:r>
+    </w:p>
+    <w:p>
+      <w:pPr>
+        <w:spacing w:after="0" w:before="120"/>
+      </w:pPr>
+      <w:r>
+        <w:t xml:space="preserve"/>
+      </w:r>
+    </w:p>
+    <w:p>
+      <w:pPr>
+        <w:pStyle w:val="Heading2"/>
+        <w:spacing w:after="160" w:before="380"/>
+      </w:pPr>
+      <w:r>
+        <w:rPr>
+          <w:rFonts w:ascii="Arial" w:cs="Arial" w:eastAsia="Arial" w:hAnsi="Arial"/>
+          <w:b/>
+          <w:bCs/>
+          <w:color w:val="1E6091"/>
+          <w:sz w:val="26"/>
+          <w:szCs w:val="26"/>
+        </w:rPr>
+        <w:t xml:space="preserve">18.3 Correção 3 — Trigger trg_status_apos_pagamento</w:t>
+      </w:r>
+    </w:p>
+    <w:tbl>
+      <w:tblPr>
+        <w:tblW w:type="dxa" w:w="9200"/>
+        <w:tblBorders>
+          <w:top w:val="single" w:color="auto" w:sz="4"/>
+          <w:left w:val="single" w:color="auto" w:sz="4"/>
+          <w:bottom w:val="single" w:color="auto" w:sz="4"/>
+          <w:right w:val="single" w:color="auto" w:sz="4"/>
+          <w:insideH w:val="single" w:color="auto" w:sz="4"/>
+          <w:insideV w:val="single" w:color="auto" w:sz="4"/>
+        </w:tblBorders>
+      </w:tblPr>
+      <w:tblGrid>
+        <w:gridCol w:w="9200"/>
+      </w:tblGrid>
+      <w:tr>
+        <w:tc>
+          <w:tcPr>
+            <w:tcBorders>
+              <w:top w:val="single" w:color="2D6A4F" w:sz="6"/>
+              <w:left w:val="single" w:color="2D6A4F" w:sz="6"/>
+              <w:bottom w:val="single" w:color="2D6A4F" w:sz="6"/>
+              <w:right w:val="single" w:color="2D6A4F" w:sz="6"/>
+            </w:tcBorders>
+            <w:shd w:fill="D8F3DC" w:val="clear"/>
+            <w:tcMar>
+              <w:top w:type="dxa" w:w="120"/>
+              <w:left w:type="dxa" w:w="180"/>
+              <w:bottom w:type="dxa" w:w="120"/>
+              <w:right w:type="dxa" w:w="180"/>
+            </w:tcMar>
+          </w:tcPr>
+          <w:p>
+            <w:r>
+              <w:rPr>
+                <w:rFonts w:ascii="Arial" w:cs="Arial" w:eastAsia="Arial" w:hAnsi="Arial"/>
+                <w:b/>
+                <w:bCs/>
+                <w:color w:val="1B4332"/>
+                <w:sz w:val="20"/>
+                <w:szCs w:val="20"/>
+              </w:rPr>
+              <w:t xml:space="preserve">Contagem de parcelas agora ignora status = 'cancelado'</w:t>
+            </w:r>
+          </w:p>
+        </w:tc>
+      </w:tr>
+    </w:tbl>
+    <w:p>
+      <w:pPr>
+        <w:spacing w:after="0" w:before="80"/>
+      </w:pPr>
+      <w:r>
+        <w:t xml:space="preserve"/>
+      </w:r>
+    </w:p>
+    <w:p>
+      <w:pPr>
+        <w:spacing w:after="100" w:before="60"/>
+      </w:pPr>
+      <w:r>
+        <w:rPr>
+          <w:rFonts w:ascii="Arial" w:cs="Arial" w:eastAsia="Arial" w:hAnsi="Arial"/>
+          <w:color w:val="1A202C"/>
+          <w:sz w:val="22"/>
+          <w:szCs w:val="22"/>
+        </w:rPr>
+        <w:t xml:space="preserve">Problema: parcelas canceladas entravam na contagem total, fazendo a matrícula nunca ser encerrada automaticamente mesmo com todas as parcelas válidas pagas.</w:t>
+      </w:r>
+    </w:p>
+    <w:tbl>
+      <w:tblPr>
+        <w:tblW w:type="dxa" w:w="9200"/>
+        <w:tblBorders>
+          <w:top w:val="single" w:color="auto" w:sz="4"/>
+          <w:left w:val="single" w:color="auto" w:sz="4"/>
+          <w:bottom w:val="single" w:color="auto" w:sz="4"/>
+          <w:right w:val="single" w:color="auto" w:sz="4"/>
+          <w:insideH w:val="single" w:color="auto" w:sz="4"/>
+          <w:insideV w:val="single" w:color="auto" w:sz="4"/>
+        </w:tblBorders>
+      </w:tblPr>
+      <w:tblGrid>
+        <w:gridCol w:w="9200"/>
+      </w:tblGrid>
+      <w:tr>
+        <w:tc>
+          <w:tcPr>
+            <w:tcBorders>
+              <w:top w:val="single" w:color="00B4D8" w:sz="8"/>
+              <w:left w:val="single" w:color="00B4D8" w:sz="24"/>
+              <w:bottom w:val="single" w:color="00B4D8" w:sz="8"/>
+              <w:right w:val="single" w:color="E2E8F0" w:sz="4"/>
+            </w:tcBorders>
+            <w:shd w:fill="0D1B2A" w:val="clear"/>
+            <w:tcMar>
+              <w:top w:type="dxa" w:w="140"/>
+              <w:left w:type="dxa" w:w="200"/>
+              <w:bottom w:type="dxa" w:w="140"/>
+              <w:right w:type="dxa" w:w="200"/>
+            </w:tcMar>
+          </w:tcPr>
+          <w:p>
+            <w:pPr>
+              <w:spacing w:after="0" w:before="0"/>
+            </w:pPr>
+            <w:r>
+              <w:rPr>
+                <w:rFonts w:ascii="Courier New" w:cs="Courier New" w:eastAsia="Courier New" w:hAnsi="Courier New"/>
+                <w:color w:val="90E0EF"/>
+                <w:sz w:val="17"/>
+                <w:szCs w:val="17"/>
+              </w:rPr>
+              <w:t xml:space="preserve">-- ANTES (bug): contava parcelas canceladas</w:t>
+            </w:r>
+          </w:p>
+          <w:p>
+            <w:pPr>
+              <w:spacing w:after="0" w:before="0"/>
+            </w:pPr>
+            <w:r>
+              <w:rPr>
+                <w:rFonts w:ascii="Courier New" w:cs="Courier New" w:eastAsia="Courier New" w:hAnsi="Courier New"/>
+                <w:color w:val="90E0EF"/>
+                <w:sz w:val="17"/>
+                <w:szCs w:val="17"/>
+              </w:rPr>
+              <w:t xml:space="preserve">SELECT COUNT(*) INTO v_total FROM pagamento WHERE id_matricula = NEW.id_matricula;</w:t>
+            </w:r>
+          </w:p>
+          <w:p>
+            <w:pPr>
+              <w:spacing w:after="0" w:before="10"/>
+            </w:pPr>
+            <w:r>
+              <w:rPr>
+                <w:rFonts w:ascii="Courier New" w:cs="Courier New" w:eastAsia="Courier New" w:hAnsi="Courier New"/>
+                <w:color w:val="90E0EF"/>
+                <w:sz w:val="17"/>
+                <w:szCs w:val="17"/>
+              </w:rPr>
+              <w:t xml:space="preserve">-- DEPOIS (correto): ignora canceladas</w:t>
+            </w:r>
+          </w:p>
+          <w:p>
+            <w:pPr>
+              <w:spacing w:after="0" w:before="0"/>
+            </w:pPr>
+            <w:r>
+              <w:rPr>
+                <w:rFonts w:ascii="Courier New" w:cs="Courier New" w:eastAsia="Courier New" w:hAnsi="Courier New"/>
+                <w:color w:val="90E0EF"/>
+                <w:sz w:val="17"/>
+                <w:szCs w:val="17"/>
+              </w:rPr>
+              <w:t xml:space="preserve">SELECT COUNT(*) INTO v_total FROM pagamento</w:t>
+            </w:r>
+          </w:p>
+          <w:p>
+            <w:pPr>
+              <w:spacing w:after="0" w:before="0"/>
+            </w:pPr>
+            <w:r>
+              <w:rPr>
+                <w:rFonts w:ascii="Courier New" w:cs="Courier New" w:eastAsia="Courier New" w:hAnsi="Courier New"/>
+                <w:color w:val="90E0EF"/>
+                <w:sz w:val="17"/>
+                <w:szCs w:val="17"/>
+              </w:rPr>
+              <w:t xml:space="preserve">WHERE id_matricula = NEW.id_matricula AND status != 'cancelado';</w:t>
+            </w:r>
+          </w:p>
+        </w:tc>
+      </w:tr>
+    </w:tbl>
+    <w:p>
+      <w:pPr>
+        <w:spacing w:after="0" w:before="120"/>
+      </w:pPr>
+      <w:r>
+        <w:t xml:space="preserve"/>
+      </w:r>
+    </w:p>
+    <w:p>
+      <w:pPr>
+        <w:pStyle w:val="Heading2"/>
+        <w:spacing w:after="160" w:before="380"/>
+      </w:pPr>
+      <w:r>
+        <w:rPr>
+          <w:rFonts w:ascii="Arial" w:cs="Arial" w:eastAsia="Arial" w:hAnsi="Arial"/>
+          <w:b/>
+          <w:bCs/>
+          <w:color w:val="1E6091"/>
+          <w:sz w:val="26"/>
+          <w:szCs w:val="26"/>
+        </w:rPr>
+        <w:t xml:space="preserve">18.4 Correção 4 — Trigger trg_updated_at_matricula</w:t>
+      </w:r>
+    </w:p>
+    <w:tbl>
+      <w:tblPr>
+        <w:tblW w:type="dxa" w:w="9200"/>
+        <w:tblBorders>
+          <w:top w:val="single" w:color="auto" w:sz="4"/>
+          <w:left w:val="single" w:color="auto" w:sz="4"/>
+          <w:bottom w:val="single" w:color="auto" w:sz="4"/>
+          <w:right w:val="single" w:color="auto" w:sz="4"/>
+          <w:insideH w:val="single" w:color="auto" w:sz="4"/>
+          <w:insideV w:val="single" w:color="auto" w:sz="4"/>
+        </w:tblBorders>
+      </w:tblPr>
+      <w:tblGrid>
+        <w:gridCol w:w="9200"/>
+      </w:tblGrid>
+      <w:tr>
+        <w:tc>
+          <w:tcPr>
+            <w:tcBorders>
+              <w:top w:val="single" w:color="2D6A4F" w:sz="6"/>
+              <w:left w:val="single" w:color="2D6A4F" w:sz="6"/>
+              <w:bottom w:val="single" w:color="2D6A4F" w:sz="6"/>
+              <w:right w:val="single" w:color="2D6A4F" w:sz="6"/>
+            </w:tcBorders>
+            <w:shd w:fill="D8F3DC" w:val="clear"/>
+            <w:tcMar>
+              <w:top w:type="dxa" w:w="120"/>
+              <w:left w:type="dxa" w:w="180"/>
+              <w:bottom w:type="dxa" w:w="120"/>
+              <w:right w:type="dxa" w:w="180"/>
+            </w:tcMar>
+          </w:tcPr>
+          <w:p>
+            <w:r>
+              <w:rPr>
+                <w:rFonts w:ascii="Arial" w:cs="Arial" w:eastAsia="Arial" w:hAnsi="Arial"/>
+                <w:b/>
+                <w:bCs/>
+                <w:color w:val="1B4332"/>
+                <w:sz w:val="20"/>
+                <w:szCs w:val="20"/>
+              </w:rPr>
+              <w:t xml:space="preserve">Trigger estava ausente no banco — adicionada corretamente</w:t>
+            </w:r>
+          </w:p>
+        </w:tc>
+      </w:tr>
+    </w:tbl>
+    <w:p>
+      <w:pPr>
+        <w:spacing w:after="0" w:before="80"/>
+      </w:pPr>
+      <w:r>
+        <w:t xml:space="preserve"/>
+      </w:r>
+    </w:p>
+    <w:p>
+      <w:pPr>
+        <w:spacing w:after="100" w:before="60"/>
+      </w:pPr>
+      <w:r>
+        <w:rPr>
+          <w:rFonts w:ascii="Arial" w:cs="Arial" w:eastAsia="Arial" w:hAnsi="Arial"/>
+          <w:color w:val="1A202C"/>
+          <w:sz w:val="22"/>
+          <w:szCs w:val="22"/>
+        </w:rPr>
+        <w:t xml:space="preserve">Problema: o relatório documentava a trigger como existente, mas ela não havia sido criada. Qualquer UPDATE em matrícula não atualizava o campo updated_at.</w:t>
+      </w:r>
+    </w:p>
+    <w:p>
+      <w:pPr>
+        <w:spacing w:after="100" w:before="60"/>
+      </w:pPr>
+      <w:r>
+        <w:rPr>
+          <w:rFonts w:ascii="Arial" w:cs="Arial" w:eastAsia="Arial" w:hAnsi="Arial"/>
+          <w:color w:val="1A202C"/>
+          <w:sz w:val="22"/>
+          <w:szCs w:val="22"/>
+        </w:rPr>
+        <w:t xml:space="preserve">Solução: trigger criada corretamente no master.sql.</w:t>
+      </w:r>
+    </w:p>
+    <w:p>
+      <w:pPr>
+        <w:spacing w:after="0" w:before="120"/>
+      </w:pPr>
+      <w:r>
+        <w:t xml:space="preserve"/>
+      </w:r>
+    </w:p>
+    <w:p>
+      <w:pPr>
+        <w:pStyle w:val="Heading2"/>
+        <w:spacing w:after="160" w:before="380"/>
+      </w:pPr>
+      <w:r>
+        <w:rPr>
+          <w:rFonts w:ascii="Arial" w:cs="Arial" w:eastAsia="Arial" w:hAnsi="Arial"/>
+          <w:b/>
+          <w:bCs/>
+          <w:color w:val="1E6091"/>
+          <w:sz w:val="26"/>
+          <w:szCs w:val="26"/>
+        </w:rPr>
+        <w:t xml:space="preserve">18.5 Correção 5 — DETERMINISTIC nas Functions</w:t>
+      </w:r>
+    </w:p>
+    <w:tbl>
+      <w:tblPr>
+        <w:tblW w:type="dxa" w:w="9200"/>
+        <w:tblBorders>
+          <w:top w:val="single" w:color="auto" w:sz="4"/>
+          <w:left w:val="single" w:color="auto" w:sz="4"/>
+          <w:bottom w:val="single" w:color="auto" w:sz="4"/>
+          <w:right w:val="single" w:color="auto" w:sz="4"/>
+          <w:insideH w:val="single" w:color="auto" w:sz="4"/>
+          <w:insideV w:val="single" w:color="auto" w:sz="4"/>
+        </w:tblBorders>
+      </w:tblPr>
+      <w:tblGrid>
+        <w:gridCol w:w="9200"/>
+      </w:tblGrid>
+      <w:tr>
+        <w:tc>
+          <w:tcPr>
+            <w:tcBorders>
+              <w:top w:val="single" w:color="2D6A4F" w:sz="6"/>
+              <w:left w:val="single" w:color="2D6A4F" w:sz="6"/>
+              <w:bottom w:val="single" w:color="2D6A4F" w:sz="6"/>
+              <w:right w:val="single" w:color="2D6A4F" w:sz="6"/>
+            </w:tcBorders>
+            <w:shd w:fill="D8F3DC" w:val="clear"/>
+            <w:tcMar>
+              <w:top w:type="dxa" w:w="120"/>
+              <w:left w:type="dxa" w:w="180"/>
+              <w:bottom w:type="dxa" w:w="120"/>
+              <w:right w:type="dxa" w:w="180"/>
+            </w:tcMar>
+          </w:tcPr>
+          <w:p>
+            <w:r>
+              <w:rPr>
+                <w:rFonts w:ascii="Arial" w:cs="Arial" w:eastAsia="Arial" w:hAnsi="Arial"/>
+                <w:b/>
+                <w:bCs/>
+                <w:color w:val="1B4332"/>
+                <w:sz w:val="20"/>
+                <w:szCs w:val="20"/>
+              </w:rPr>
+              <w:t xml:space="preserve">Functions que leem dados do banco: DETERMINISTIC → READS SQL DATA</w:t>
+            </w:r>
+          </w:p>
+        </w:tc>
+      </w:tr>
+    </w:tbl>
+    <w:p>
+      <w:pPr>
+        <w:spacing w:after="0" w:before="80"/>
+      </w:pPr>
+      <w:r>
+        <w:t xml:space="preserve"/>
+      </w:r>
+    </w:p>
+    <w:p>
+      <w:pPr>
+        <w:spacing w:after="100" w:before="60"/>
+      </w:pPr>
+      <w:r>
+        <w:rPr>
+          <w:rFonts w:ascii="Arial" w:cs="Arial" w:eastAsia="Arial" w:hAnsi="Arial"/>
+          <w:color w:val="1A202C"/>
+          <w:sz w:val="22"/>
+          <w:szCs w:val="22"/>
+        </w:rPr>
+        <w:t xml:space="preserve">Problema: functions que fazem SELECT no banco estavam marcadas como DETERMINISTIC. Uma function só é DETERMINISTIC se retorna sempre o mesmo resultado para os mesmos parâmetros, sem depender de dados externos ou de funções como CURDATE().</w:t>
+      </w:r>
+    </w:p>
+    <w:tbl>
+      <w:tblPr>
+        <w:tblW w:type="dxa" w:w="9200"/>
+        <w:tblBorders>
+          <w:top w:val="single" w:color="auto" w:sz="4"/>
+          <w:left w:val="single" w:color="auto" w:sz="4"/>
+          <w:bottom w:val="single" w:color="auto" w:sz="4"/>
+          <w:right w:val="single" w:color="auto" w:sz="4"/>
+          <w:insideH w:val="single" w:color="auto" w:sz="4"/>
+          <w:insideV w:val="single" w:color="auto" w:sz="4"/>
+        </w:tblBorders>
+      </w:tblPr>
+      <w:tblGrid>
+        <w:gridCol w:w="2800"/>
+        <w:gridCol w:w="1600"/>
+        <w:gridCol w:w="1600"/>
+        <w:gridCol w:w="3200"/>
+      </w:tblGrid>
+      <w:tr>
+        <w:trPr>
+          <w:tblHeader/>
+        </w:trPr>
+        <w:tc>
+          <w:tcPr>
+            <w:tcBorders>
+              <w:top w:val="single" w:color="E2E8F0" w:sz="6"/>
+              <w:left w:val="single" w:color="E2E8F0" w:sz="6"/>
+              <w:bottom w:val="single" w:color="E2E8F0" w:sz="6"/>
+              <w:right w:val="single" w:color="E2E8F0" w:sz="6"/>
+            </w:tcBorders>
+            <w:shd w:fill="0D1B2A" w:val="clear"/>
+            <w:tcMar>
+              <w:top w:type="dxa" w:w="100"/>
+              <w:left w:type="dxa" w:w="140"/>
+              <w:bottom w:type="dxa" w:w="100"/>
+              <w:right w:type="dxa" w:w="140"/>
+            </w:tcMar>
+            <w:vAlign w:val="center"/>
+          </w:tcPr>
+          <w:p>
+            <w:r>
+              <w:rPr>
+                <w:rFonts w:ascii="Arial" w:cs="Arial" w:eastAsia="Arial" w:hAnsi="Arial"/>
+                <w:b/>
+                <w:bCs/>
+                <w:color w:val="FFFFFF"/>
+                <w:sz w:val="20"/>
+                <w:szCs w:val="20"/>
+              </w:rPr>
+              <w:t xml:space="preserve">Function</w:t>
+            </w:r>
+          </w:p>
+        </w:tc>
+        <w:tc>
+          <w:tcPr>
+            <w:tcBorders>
+              <w:top w:val="single" w:color="E2E8F0" w:sz="6"/>
+              <w:left w:val="single" w:color="E2E8F0" w:sz="6"/>
+              <w:bottom w:val="single" w:color="E2E8F0" w:sz="6"/>
+              <w:right w:val="single" w:color="E2E8F0" w:sz="6"/>
+            </w:tcBorders>
+            <w:shd w:fill="0D1B2A" w:val="clear"/>
+            <w:tcMar>
+              <w:top w:type="dxa" w:w="100"/>
+              <w:left w:type="dxa" w:w="140"/>
+              <w:bottom w:type="dxa" w:w="100"/>
+              <w:right w:type="dxa" w:w="140"/>
+            </w:tcMar>
+            <w:vAlign w:val="center"/>
+          </w:tcPr>
+          <w:p>
+            <w:r>
+              <w:rPr>
+                <w:rFonts w:ascii="Arial" w:cs="Arial" w:eastAsia="Arial" w:hAnsi="Arial"/>
+                <w:b/>
+                <w:bCs/>
+                <w:color w:val="FFFFFF"/>
+                <w:sz w:val="20"/>
+                <w:szCs w:val="20"/>
+              </w:rPr>
+              <w:t xml:space="preserve">v1.0</w:t>
+            </w:r>
+          </w:p>
+        </w:tc>
+        <w:tc>
+          <w:tcPr>
+            <w:tcBorders>
+              <w:top w:val="single" w:color="E2E8F0" w:sz="6"/>
+              <w:left w:val="single" w:color="E2E8F0" w:sz="6"/>
+              <w:bottom w:val="single" w:color="E2E8F0" w:sz="6"/>
+              <w:right w:val="single" w:color="E2E8F0" w:sz="6"/>
+            </w:tcBorders>
+            <w:shd w:fill="0D1B2A" w:val="clear"/>
+            <w:tcMar>
+              <w:top w:type="dxa" w:w="100"/>
+              <w:left w:type="dxa" w:w="140"/>
+              <w:bottom w:type="dxa" w:w="100"/>
+              <w:right w:type="dxa" w:w="140"/>
+            </w:tcMar>
+            <w:vAlign w:val="center"/>
+          </w:tcPr>
+          <w:p>
+            <w:r>
+              <w:rPr>
+                <w:rFonts w:ascii="Arial" w:cs="Arial" w:eastAsia="Arial" w:hAnsi="Arial"/>
+                <w:b/>
+                <w:bCs/>
+                <w:color w:val="FFFFFF"/>
+                <w:sz w:val="20"/>
+                <w:szCs w:val="20"/>
+              </w:rPr>
+              <w:t xml:space="preserve">v2.0</w:t>
+            </w:r>
+          </w:p>
+        </w:tc>
+        <w:tc>
+          <w:tcPr>
+            <w:tcBorders>
+              <w:top w:val="single" w:color="E2E8F0" w:sz="6"/>
+              <w:left w:val="single" w:color="E2E8F0" w:sz="6"/>
+              <w:bottom w:val="single" w:color="E2E8F0" w:sz="6"/>
+              <w:right w:val="single" w:color="E2E8F0" w:sz="6"/>
+            </w:tcBorders>
+            <w:shd w:fill="0D1B2A" w:val="clear"/>
+            <w:tcMar>
+              <w:top w:type="dxa" w:w="100"/>
+              <w:left w:type="dxa" w:w="140"/>
+              <w:bottom w:type="dxa" w:w="100"/>
+              <w:right w:type="dxa" w:w="140"/>
+            </w:tcMar>
+            <w:vAlign w:val="center"/>
+          </w:tcPr>
+          <w:p>
+            <w:r>
+              <w:rPr>
+                <w:rFonts w:ascii="Arial" w:cs="Arial" w:eastAsia="Arial" w:hAnsi="Arial"/>
+                <w:b/>
+                <w:bCs/>
+                <w:color w:val="FFFFFF"/>
+                <w:sz w:val="20"/>
+                <w:szCs w:val="20"/>
+              </w:rPr>
+              <w:t xml:space="preserve">Motivo</w:t>
+            </w:r>
+          </w:p>
+        </w:tc>
+      </w:tr>
+      <w:tr>
+        <w:trPr>
+          <w:tblHeader w:val="false"/>
+        </w:trPr>
+        <w:tc>
+          <w:tcPr>
+            <w:tcBorders>
+              <w:top w:val="single" w:color="E2E8F0" w:sz="4"/>
+              <w:left w:val="single" w:color="E2E8F0" w:sz="4"/>
+              <w:bottom w:val="single" w:color="E2E8F0" w:sz="4"/>
+              <w:right w:val="single" w:color="E2E8F0" w:sz="4"/>
+            </w:tcBorders>
+            <w:shd w:fill="FFFFFF" w:val="clear"/>
+            <w:tcMar>
+              <w:top w:type="dxa" w:w="100"/>
+              <w:left w:type="dxa" w:w="140"/>
+              <w:bottom w:type="dxa" w:w="100"/>
+              <w:right w:type="dxa" w:w="140"/>
+            </w:tcMar>
+            <w:vAlign w:val="center"/>
+          </w:tcPr>
+          <w:p>
+            <w:r>
+              <w:rPr>
+                <w:rFonts w:ascii="Arial" w:cs="Arial" w:eastAsia="Arial" w:hAnsi="Arial"/>
+                <w:b/>
+                <w:bCs/>
+                <w:color w:val="1A202C"/>
+                <w:sz w:val="20"/>
+                <w:szCs w:val="20"/>
+              </w:rPr>
+              <w:t xml:space="preserve">fn_calcular_imc</w:t>
+            </w:r>
+          </w:p>
+        </w:tc>
+        <w:tc>
+          <w:tcPr>
+            <w:tcBorders>
+              <w:top w:val="single" w:color="E2E8F0" w:sz="4"/>
+              <w:left w:val="single" w:color="E2E8F0" w:sz="4"/>
+              <w:bottom w:val="single" w:color="E2E8F0" w:sz="4"/>
+              <w:right w:val="single" w:color="E2E8F0" w:sz="4"/>
+            </w:tcBorders>
+            <w:shd w:fill="FFFFFF" w:val="clear"/>
+            <w:tcMar>
+              <w:top w:type="dxa" w:w="100"/>
+              <w:left w:type="dxa" w:w="140"/>
+              <w:bottom w:type="dxa" w:w="100"/>
+              <w:right w:type="dxa" w:w="140"/>
+            </w:tcMar>
+            <w:vAlign w:val="center"/>
+          </w:tcPr>
+          <w:p>
+            <w:r>
+              <w:rPr>
+                <w:rFonts w:ascii="Arial" w:cs="Arial" w:eastAsia="Arial" w:hAnsi="Arial"/>
+                <w:b w:val="false"/>
+                <w:bCs w:val="false"/>
+                <w:color w:val="1A202C"/>
+                <w:sz w:val="20"/>
+                <w:szCs w:val="20"/>
+              </w:rPr>
+              <w:t xml:space="preserve">DETERMINISTIC</w:t>
+            </w:r>
+          </w:p>
+        </w:tc>
+        <w:tc>
+          <w:tcPr>
+            <w:tcBorders>
+              <w:top w:val="single" w:color="E2E8F0" w:sz="4"/>
+              <w:left w:val="single" w:color="E2E8F0" w:sz="4"/>
+              <w:bottom w:val="single" w:color="E2E8F0" w:sz="4"/>
+              <w:right w:val="single" w:color="E2E8F0" w:sz="4"/>
+            </w:tcBorders>
+            <w:shd w:fill="FFFFFF" w:val="clear"/>
+            <w:tcMar>
+              <w:top w:type="dxa" w:w="100"/>
+              <w:left w:type="dxa" w:w="140"/>
+              <w:bottom w:type="dxa" w:w="100"/>
+              <w:right w:type="dxa" w:w="140"/>
+            </w:tcMar>
+            <w:vAlign w:val="center"/>
+          </w:tcPr>
+          <w:p>
+            <w:r>
+              <w:rPr>
+                <w:rFonts w:ascii="Arial" w:cs="Arial" w:eastAsia="Arial" w:hAnsi="Arial"/>
+                <w:b w:val="false"/>
+                <w:bCs w:val="false"/>
+                <w:color w:val="1A202C"/>
+                <w:sz w:val="20"/>
+                <w:szCs w:val="20"/>
+              </w:rPr>
+              <w:t xml:space="preserve">DETERMINISTIC</w:t>
+            </w:r>
+          </w:p>
+        </w:tc>
+        <w:tc>
+          <w:tcPr>
+            <w:tcBorders>
+              <w:top w:val="single" w:color="E2E8F0" w:sz="4"/>
+              <w:left w:val="single" w:color="E2E8F0" w:sz="4"/>
+              <w:bottom w:val="single" w:color="E2E8F0" w:sz="4"/>
+              <w:right w:val="single" w:color="E2E8F0" w:sz="4"/>
+            </w:tcBorders>
+            <w:shd w:fill="FFFFFF" w:val="clear"/>
+            <w:tcMar>
+              <w:top w:type="dxa" w:w="100"/>
+              <w:left w:type="dxa" w:w="140"/>
+              <w:bottom w:type="dxa" w:w="100"/>
+              <w:right w:type="dxa" w:w="140"/>
+            </w:tcMar>
+            <w:vAlign w:val="center"/>
+          </w:tcPr>
+          <w:p>
+            <w:r>
+              <w:rPr>
+                <w:rFonts w:ascii="Arial" w:cs="Arial" w:eastAsia="Arial" w:hAnsi="Arial"/>
+                <w:b w:val="false"/>
+                <w:bCs w:val="false"/>
+                <w:color w:val="1A202C"/>
+                <w:sz w:val="20"/>
+                <w:szCs w:val="20"/>
+              </w:rPr>
+              <w:t xml:space="preserve">Correto — só usa parâmetros matemáticos</w:t>
+            </w:r>
+          </w:p>
+        </w:tc>
+      </w:tr>
+      <w:tr>
+        <w:trPr>
+          <w:tblHeader w:val="false"/>
+        </w:trPr>
+        <w:tc>
+          <w:tcPr>
+            <w:tcBorders>
+              <w:top w:val="single" w:color="E2E8F0" w:sz="4"/>
+              <w:left w:val="single" w:color="E2E8F0" w:sz="4"/>
+              <w:bottom w:val="single" w:color="E2E8F0" w:sz="4"/>
+              <w:right w:val="single" w:color="E2E8F0" w:sz="4"/>
+            </w:tcBorders>
+            <w:shd w:fill="F7FAFC" w:val="clear"/>
+            <w:tcMar>
+              <w:top w:type="dxa" w:w="100"/>
+              <w:left w:type="dxa" w:w="140"/>
+              <w:bottom w:type="dxa" w:w="100"/>
+              <w:right w:type="dxa" w:w="140"/>
+            </w:tcMar>
+            <w:vAlign w:val="center"/>
+          </w:tcPr>
+          <w:p>
+            <w:r>
+              <w:rPr>
+                <w:rFonts w:ascii="Arial" w:cs="Arial" w:eastAsia="Arial" w:hAnsi="Arial"/>
+                <w:b/>
+                <w:bCs/>
+                <w:color w:val="1A202C"/>
+                <w:sz w:val="20"/>
+                <w:szCs w:val="20"/>
+              </w:rPr>
+              <w:t xml:space="preserve">fn_idade_aluno</w:t>
+            </w:r>
+          </w:p>
+        </w:tc>
+        <w:tc>
+          <w:tcPr>
+            <w:tcBorders>
+              <w:top w:val="single" w:color="E2E8F0" w:sz="4"/>
+              <w:left w:val="single" w:color="E2E8F0" w:sz="4"/>
+              <w:bottom w:val="single" w:color="E2E8F0" w:sz="4"/>
+              <w:right w:val="single" w:color="E2E8F0" w:sz="4"/>
+            </w:tcBorders>
+            <w:shd w:fill="F7FAFC" w:val="clear"/>
+            <w:tcMar>
+              <w:top w:type="dxa" w:w="100"/>
+              <w:left w:type="dxa" w:w="140"/>
+              <w:bottom w:type="dxa" w:w="100"/>
+              <w:right w:type="dxa" w:w="140"/>
+            </w:tcMar>
+            <w:vAlign w:val="center"/>
+          </w:tcPr>
+          <w:p>
+            <w:r>
+              <w:rPr>
+                <w:rFonts w:ascii="Arial" w:cs="Arial" w:eastAsia="Arial" w:hAnsi="Arial"/>
+                <w:b w:val="false"/>
+                <w:bCs w:val="false"/>
+                <w:color w:val="1A202C"/>
+                <w:sz w:val="20"/>
+                <w:szCs w:val="20"/>
+              </w:rPr>
+              <w:t xml:space="preserve">DETERMINISTIC</w:t>
+            </w:r>
+          </w:p>
+        </w:tc>
+        <w:tc>
+          <w:tcPr>
+            <w:tcBorders>
+              <w:top w:val="single" w:color="E2E8F0" w:sz="4"/>
+              <w:left w:val="single" w:color="E2E8F0" w:sz="4"/>
+              <w:bottom w:val="single" w:color="E2E8F0" w:sz="4"/>
+              <w:right w:val="single" w:color="E2E8F0" w:sz="4"/>
+            </w:tcBorders>
+            <w:shd w:fill="F7FAFC" w:val="clear"/>
+            <w:tcMar>
+              <w:top w:type="dxa" w:w="100"/>
+              <w:left w:type="dxa" w:w="140"/>
+              <w:bottom w:type="dxa" w:w="100"/>
+              <w:right w:type="dxa" w:w="140"/>
+            </w:tcMar>
+            <w:vAlign w:val="center"/>
+          </w:tcPr>
+          <w:p>
+            <w:r>
+              <w:rPr>
+                <w:rFonts w:ascii="Arial" w:cs="Arial" w:eastAsia="Arial" w:hAnsi="Arial"/>
+                <w:b w:val="false"/>
+                <w:bCs w:val="false"/>
+                <w:color w:val="1A202C"/>
+                <w:sz w:val="20"/>
+                <w:szCs w:val="20"/>
+              </w:rPr>
+              <w:t xml:space="preserve">READS SQL DATA</w:t>
+            </w:r>
+          </w:p>
+        </w:tc>
+        <w:tc>
+          <w:tcPr>
+            <w:tcBorders>
+              <w:top w:val="single" w:color="E2E8F0" w:sz="4"/>
+              <w:left w:val="single" w:color="E2E8F0" w:sz="4"/>
+              <w:bottom w:val="single" w:color="E2E8F0" w:sz="4"/>
+              <w:right w:val="single" w:color="E2E8F0" w:sz="4"/>
+            </w:tcBorders>
+            <w:shd w:fill="F7FAFC" w:val="clear"/>
+            <w:tcMar>
+              <w:top w:type="dxa" w:w="100"/>
+              <w:left w:type="dxa" w:w="140"/>
+              <w:bottom w:type="dxa" w:w="100"/>
+              <w:right w:type="dxa" w:w="140"/>
+            </w:tcMar>
+            <w:vAlign w:val="center"/>
+          </w:tcPr>
+          <w:p>
+            <w:r>
+              <w:rPr>
+                <w:rFonts w:ascii="Arial" w:cs="Arial" w:eastAsia="Arial" w:hAnsi="Arial"/>
+                <w:b w:val="false"/>
+                <w:bCs w:val="false"/>
+                <w:color w:val="1A202C"/>
+                <w:sz w:val="20"/>
+                <w:szCs w:val="20"/>
+              </w:rPr>
+              <w:t xml:space="preserve">Depende de CURDATE() e dados do banco</w:t>
+            </w:r>
+          </w:p>
+        </w:tc>
+      </w:tr>
+      <w:tr>
+        <w:trPr>
+          <w:tblHeader w:val="false"/>
+        </w:trPr>
+        <w:tc>
+          <w:tcPr>
+            <w:tcBorders>
+              <w:top w:val="single" w:color="E2E8F0" w:sz="4"/>
+              <w:left w:val="single" w:color="E2E8F0" w:sz="4"/>
+              <w:bottom w:val="single" w:color="E2E8F0" w:sz="4"/>
+              <w:right w:val="single" w:color="E2E8F0" w:sz="4"/>
+            </w:tcBorders>
+            <w:shd w:fill="FFFFFF" w:val="clear"/>
+            <w:tcMar>
+              <w:top w:type="dxa" w:w="100"/>
+              <w:left w:type="dxa" w:w="140"/>
+              <w:bottom w:type="dxa" w:w="100"/>
+              <w:right w:type="dxa" w:w="140"/>
+            </w:tcMar>
+            <w:vAlign w:val="center"/>
+          </w:tcPr>
+          <w:p>
+            <w:r>
+              <w:rPr>
+                <w:rFonts w:ascii="Arial" w:cs="Arial" w:eastAsia="Arial" w:hAnsi="Arial"/>
+                <w:b/>
+                <w:bCs/>
+                <w:color w:val="1A202C"/>
+                <w:sz w:val="20"/>
+                <w:szCs w:val="20"/>
+              </w:rPr>
+              <w:t xml:space="preserve">fn_receita_mes</w:t>
+            </w:r>
+          </w:p>
+        </w:tc>
+        <w:tc>
+          <w:tcPr>
+            <w:tcBorders>
+              <w:top w:val="single" w:color="E2E8F0" w:sz="4"/>
+              <w:left w:val="single" w:color="E2E8F0" w:sz="4"/>
+              <w:bottom w:val="single" w:color="E2E8F0" w:sz="4"/>
+              <w:right w:val="single" w:color="E2E8F0" w:sz="4"/>
+            </w:tcBorders>
+            <w:shd w:fill="FFFFFF" w:val="clear"/>
+            <w:tcMar>
+              <w:top w:type="dxa" w:w="100"/>
+              <w:left w:type="dxa" w:w="140"/>
+              <w:bottom w:type="dxa" w:w="100"/>
+              <w:right w:type="dxa" w:w="140"/>
+            </w:tcMar>
+            <w:vAlign w:val="center"/>
+          </w:tcPr>
+          <w:p>
+            <w:r>
+              <w:rPr>
+                <w:rFonts w:ascii="Arial" w:cs="Arial" w:eastAsia="Arial" w:hAnsi="Arial"/>
+                <w:b w:val="false"/>
+                <w:bCs w:val="false"/>
+                <w:color w:val="1A202C"/>
+                <w:sz w:val="20"/>
+                <w:szCs w:val="20"/>
+              </w:rPr>
+              <w:t xml:space="preserve">DETERMINISTIC</w:t>
+            </w:r>
+          </w:p>
+        </w:tc>
+        <w:tc>
+          <w:tcPr>
+            <w:tcBorders>
+              <w:top w:val="single" w:color="E2E8F0" w:sz="4"/>
+              <w:left w:val="single" w:color="E2E8F0" w:sz="4"/>
+              <w:bottom w:val="single" w:color="E2E8F0" w:sz="4"/>
+              <w:right w:val="single" w:color="E2E8F0" w:sz="4"/>
+            </w:tcBorders>
+            <w:shd w:fill="FFFFFF" w:val="clear"/>
+            <w:tcMar>
+              <w:top w:type="dxa" w:w="100"/>
+              <w:left w:type="dxa" w:w="140"/>
+              <w:bottom w:type="dxa" w:w="100"/>
+              <w:right w:type="dxa" w:w="140"/>
+            </w:tcMar>
+            <w:vAlign w:val="center"/>
+          </w:tcPr>
+          <w:p>
+            <w:r>
+              <w:rPr>
+                <w:rFonts w:ascii="Arial" w:cs="Arial" w:eastAsia="Arial" w:hAnsi="Arial"/>
+                <w:b w:val="false"/>
+                <w:bCs w:val="false"/>
+                <w:color w:val="1A202C"/>
+                <w:sz w:val="20"/>
+                <w:szCs w:val="20"/>
+              </w:rPr>
+              <w:t xml:space="preserve">READS SQL DATA</w:t>
+            </w:r>
+          </w:p>
+        </w:tc>
+        <w:tc>
+          <w:tcPr>
+            <w:tcBorders>
+              <w:top w:val="single" w:color="E2E8F0" w:sz="4"/>
+              <w:left w:val="single" w:color="E2E8F0" w:sz="4"/>
+              <w:bottom w:val="single" w:color="E2E8F0" w:sz="4"/>
+              <w:right w:val="single" w:color="E2E8F0" w:sz="4"/>
+            </w:tcBorders>
+            <w:shd w:fill="FFFFFF" w:val="clear"/>
+            <w:tcMar>
+              <w:top w:type="dxa" w:w="100"/>
+              <w:left w:type="dxa" w:w="140"/>
+              <w:bottom w:type="dxa" w:w="100"/>
+              <w:right w:type="dxa" w:w="140"/>
+            </w:tcMar>
+            <w:vAlign w:val="center"/>
+          </w:tcPr>
+          <w:p>
+            <w:r>
+              <w:rPr>
+                <w:rFonts w:ascii="Arial" w:cs="Arial" w:eastAsia="Arial" w:hAnsi="Arial"/>
+                <w:b w:val="false"/>
+                <w:bCs w:val="false"/>
+                <w:color w:val="1A202C"/>
+                <w:sz w:val="20"/>
+                <w:szCs w:val="20"/>
+              </w:rPr>
+              <w:t xml:space="preserve">Depende de dados da tabela pagamento</w:t>
+            </w:r>
+          </w:p>
+        </w:tc>
+      </w:tr>
+      <w:tr>
+        <w:trPr>
+          <w:tblHeader w:val="false"/>
+        </w:trPr>
+        <w:tc>
+          <w:tcPr>
+            <w:tcBorders>
+              <w:top w:val="single" w:color="E2E8F0" w:sz="4"/>
+              <w:left w:val="single" w:color="E2E8F0" w:sz="4"/>
+              <w:bottom w:val="single" w:color="E2E8F0" w:sz="4"/>
+              <w:right w:val="single" w:color="E2E8F0" w:sz="4"/>
+            </w:tcBorders>
+            <w:shd w:fill="F7FAFC" w:val="clear"/>
+            <w:tcMar>
+              <w:top w:type="dxa" w:w="100"/>
+              <w:left w:type="dxa" w:w="140"/>
+              <w:bottom w:type="dxa" w:w="100"/>
+              <w:right w:type="dxa" w:w="140"/>
+            </w:tcMar>
+            <w:vAlign w:val="center"/>
+          </w:tcPr>
+          <w:p>
+            <w:r>
+              <w:rPr>
+                <w:rFonts w:ascii="Arial" w:cs="Arial" w:eastAsia="Arial" w:hAnsi="Arial"/>
+                <w:b/>
+                <w:bCs/>
+                <w:color w:val="1A202C"/>
+                <w:sz w:val="20"/>
+                <w:szCs w:val="20"/>
+              </w:rPr>
+              <w:t xml:space="preserve">fn_dias_ate_vencimento</w:t>
+            </w:r>
+          </w:p>
+        </w:tc>
+        <w:tc>
+          <w:tcPr>
+            <w:tcBorders>
+              <w:top w:val="single" w:color="E2E8F0" w:sz="4"/>
+              <w:left w:val="single" w:color="E2E8F0" w:sz="4"/>
+              <w:bottom w:val="single" w:color="E2E8F0" w:sz="4"/>
+              <w:right w:val="single" w:color="E2E8F0" w:sz="4"/>
+            </w:tcBorders>
+            <w:shd w:fill="F7FAFC" w:val="clear"/>
+            <w:tcMar>
+              <w:top w:type="dxa" w:w="100"/>
+              <w:left w:type="dxa" w:w="140"/>
+              <w:bottom w:type="dxa" w:w="100"/>
+              <w:right w:type="dxa" w:w="140"/>
+            </w:tcMar>
+            <w:vAlign w:val="center"/>
+          </w:tcPr>
+          <w:p>
+            <w:r>
+              <w:rPr>
+                <w:rFonts w:ascii="Arial" w:cs="Arial" w:eastAsia="Arial" w:hAnsi="Arial"/>
+                <w:b w:val="false"/>
+                <w:bCs w:val="false"/>
+                <w:color w:val="1A202C"/>
+                <w:sz w:val="20"/>
+                <w:szCs w:val="20"/>
+              </w:rPr>
+              <w:t xml:space="preserve">DETERMINISTIC</w:t>
+            </w:r>
+          </w:p>
+        </w:tc>
+        <w:tc>
+          <w:tcPr>
+            <w:tcBorders>
+              <w:top w:val="single" w:color="E2E8F0" w:sz="4"/>
+              <w:left w:val="single" w:color="E2E8F0" w:sz="4"/>
+              <w:bottom w:val="single" w:color="E2E8F0" w:sz="4"/>
+              <w:right w:val="single" w:color="E2E8F0" w:sz="4"/>
+            </w:tcBorders>
+            <w:shd w:fill="F7FAFC" w:val="clear"/>
+            <w:tcMar>
+              <w:top w:type="dxa" w:w="100"/>
+              <w:left w:type="dxa" w:w="140"/>
+              <w:bottom w:type="dxa" w:w="100"/>
+              <w:right w:type="dxa" w:w="140"/>
+            </w:tcMar>
+            <w:vAlign w:val="center"/>
+          </w:tcPr>
+          <w:p>
+            <w:r>
+              <w:rPr>
+                <w:rFonts w:ascii="Arial" w:cs="Arial" w:eastAsia="Arial" w:hAnsi="Arial"/>
+                <w:b w:val="false"/>
+                <w:bCs w:val="false"/>
+                <w:color w:val="1A202C"/>
+                <w:sz w:val="20"/>
+                <w:szCs w:val="20"/>
+              </w:rPr>
+              <w:t xml:space="preserve">READS SQL DATA</w:t>
+            </w:r>
+          </w:p>
+        </w:tc>
+        <w:tc>
+          <w:tcPr>
+            <w:tcBorders>
+              <w:top w:val="single" w:color="E2E8F0" w:sz="4"/>
+              <w:left w:val="single" w:color="E2E8F0" w:sz="4"/>
+              <w:bottom w:val="single" w:color="E2E8F0" w:sz="4"/>
+              <w:right w:val="single" w:color="E2E8F0" w:sz="4"/>
+            </w:tcBorders>
+            <w:shd w:fill="F7FAFC" w:val="clear"/>
+            <w:tcMar>
+              <w:top w:type="dxa" w:w="100"/>
+              <w:left w:type="dxa" w:w="140"/>
+              <w:bottom w:type="dxa" w:w="100"/>
+              <w:right w:type="dxa" w:w="140"/>
+            </w:tcMar>
+            <w:vAlign w:val="center"/>
+          </w:tcPr>
+          <w:p>
+            <w:r>
+              <w:rPr>
+                <w:rFonts w:ascii="Arial" w:cs="Arial" w:eastAsia="Arial" w:hAnsi="Arial"/>
+                <w:b w:val="false"/>
+                <w:bCs w:val="false"/>
+                <w:color w:val="1A202C"/>
+                <w:sz w:val="20"/>
+                <w:szCs w:val="20"/>
+              </w:rPr>
+              <w:t xml:space="preserve">Depende de CURDATE() e dados do banco</w:t>
+            </w:r>
+          </w:p>
+        </w:tc>
+      </w:tr>
+      <w:tr>
+        <w:trPr>
+          <w:tblHeader w:val="false"/>
+        </w:trPr>
+        <w:tc>
+          <w:tcPr>
+            <w:tcBorders>
+              <w:top w:val="single" w:color="E2E8F0" w:sz="4"/>
+              <w:left w:val="single" w:color="E2E8F0" w:sz="4"/>
+              <w:bottom w:val="single" w:color="E2E8F0" w:sz="4"/>
+              <w:right w:val="single" w:color="E2E8F0" w:sz="4"/>
+            </w:tcBorders>
+            <w:shd w:fill="FFFFFF" w:val="clear"/>
+            <w:tcMar>
+              <w:top w:type="dxa" w:w="100"/>
+              <w:left w:type="dxa" w:w="140"/>
+              <w:bottom w:type="dxa" w:w="100"/>
+              <w:right w:type="dxa" w:w="140"/>
+            </w:tcMar>
+            <w:vAlign w:val="center"/>
+          </w:tcPr>
+          <w:p>
+            <w:r>
+              <w:rPr>
+                <w:rFonts w:ascii="Arial" w:cs="Arial" w:eastAsia="Arial" w:hAnsi="Arial"/>
+                <w:b/>
+                <w:bCs/>
+                <w:color w:val="1A202C"/>
+                <w:sz w:val="20"/>
+                <w:szCs w:val="20"/>
+              </w:rPr>
+              <w:t xml:space="preserve">fn_status_matricula</w:t>
+            </w:r>
+          </w:p>
+        </w:tc>
+        <w:tc>
+          <w:tcPr>
+            <w:tcBorders>
+              <w:top w:val="single" w:color="E2E8F0" w:sz="4"/>
+              <w:left w:val="single" w:color="E2E8F0" w:sz="4"/>
+              <w:bottom w:val="single" w:color="E2E8F0" w:sz="4"/>
+              <w:right w:val="single" w:color="E2E8F0" w:sz="4"/>
+            </w:tcBorders>
+            <w:shd w:fill="FFFFFF" w:val="clear"/>
+            <w:tcMar>
+              <w:top w:type="dxa" w:w="100"/>
+              <w:left w:type="dxa" w:w="140"/>
+              <w:bottom w:type="dxa" w:w="100"/>
+              <w:right w:type="dxa" w:w="140"/>
+            </w:tcMar>
+            <w:vAlign w:val="center"/>
+          </w:tcPr>
+          <w:p>
+            <w:r>
+              <w:rPr>
+                <w:rFonts w:ascii="Arial" w:cs="Arial" w:eastAsia="Arial" w:hAnsi="Arial"/>
+                <w:b w:val="false"/>
+                <w:bCs w:val="false"/>
+                <w:color w:val="1A202C"/>
+                <w:sz w:val="20"/>
+                <w:szCs w:val="20"/>
+              </w:rPr>
+              <w:t xml:space="preserve">DETERMINISTIC</w:t>
+            </w:r>
+          </w:p>
+        </w:tc>
+        <w:tc>
+          <w:tcPr>
+            <w:tcBorders>
+              <w:top w:val="single" w:color="E2E8F0" w:sz="4"/>
+              <w:left w:val="single" w:color="E2E8F0" w:sz="4"/>
+              <w:bottom w:val="single" w:color="E2E8F0" w:sz="4"/>
+              <w:right w:val="single" w:color="E2E8F0" w:sz="4"/>
+            </w:tcBorders>
+            <w:shd w:fill="FFFFFF" w:val="clear"/>
+            <w:tcMar>
+              <w:top w:type="dxa" w:w="100"/>
+              <w:left w:type="dxa" w:w="140"/>
+              <w:bottom w:type="dxa" w:w="100"/>
+              <w:right w:type="dxa" w:w="140"/>
+            </w:tcMar>
+            <w:vAlign w:val="center"/>
+          </w:tcPr>
+          <w:p>
+            <w:r>
+              <w:rPr>
+                <w:rFonts w:ascii="Arial" w:cs="Arial" w:eastAsia="Arial" w:hAnsi="Arial"/>
+                <w:b w:val="false"/>
+                <w:bCs w:val="false"/>
+                <w:color w:val="1A202C"/>
+                <w:sz w:val="20"/>
+                <w:szCs w:val="20"/>
+              </w:rPr>
+              <w:t xml:space="preserve">READS SQL DATA</w:t>
+            </w:r>
+          </w:p>
+        </w:tc>
+        <w:tc>
+          <w:tcPr>
+            <w:tcBorders>
+              <w:top w:val="single" w:color="E2E8F0" w:sz="4"/>
+              <w:left w:val="single" w:color="E2E8F0" w:sz="4"/>
+              <w:bottom w:val="single" w:color="E2E8F0" w:sz="4"/>
+              <w:right w:val="single" w:color="E2E8F0" w:sz="4"/>
+            </w:tcBorders>
+            <w:shd w:fill="FFFFFF" w:val="clear"/>
+            <w:tcMar>
+              <w:top w:type="dxa" w:w="100"/>
+              <w:left w:type="dxa" w:w="140"/>
+              <w:bottom w:type="dxa" w:w="100"/>
+              <w:right w:type="dxa" w:w="140"/>
+            </w:tcMar>
+            <w:vAlign w:val="center"/>
+          </w:tcPr>
+          <w:p>
+            <w:r>
+              <w:rPr>
+                <w:rFonts w:ascii="Arial" w:cs="Arial" w:eastAsia="Arial" w:hAnsi="Arial"/>
+                <w:b w:val="false"/>
+                <w:bCs w:val="false"/>
+                <w:color w:val="1A202C"/>
+                <w:sz w:val="20"/>
+                <w:szCs w:val="20"/>
+              </w:rPr>
+              <w:t xml:space="preserve">Depende de dados da tabela matricula</w:t>
+            </w:r>
+          </w:p>
+        </w:tc>
+      </w:tr>
+      <w:tr>
+        <w:trPr>
+          <w:tblHeader w:val="false"/>
+        </w:trPr>
+        <w:tc>
+          <w:tcPr>
+            <w:tcBorders>
+              <w:top w:val="single" w:color="E2E8F0" w:sz="4"/>
+              <w:left w:val="single" w:color="E2E8F0" w:sz="4"/>
+              <w:bottom w:val="single" w:color="E2E8F0" w:sz="4"/>
+              <w:right w:val="single" w:color="E2E8F0" w:sz="4"/>
+            </w:tcBorders>
+            <w:shd w:fill="F7FAFC" w:val="clear"/>
+            <w:tcMar>
+              <w:top w:type="dxa" w:w="100"/>
+              <w:left w:type="dxa" w:w="140"/>
+              <w:bottom w:type="dxa" w:w="100"/>
+              <w:right w:type="dxa" w:w="140"/>
+            </w:tcMar>
+            <w:vAlign w:val="center"/>
+          </w:tcPr>
+          <w:p>
+            <w:r>
+              <w:rPr>
+                <w:rFonts w:ascii="Arial" w:cs="Arial" w:eastAsia="Arial" w:hAnsi="Arial"/>
+                <w:b/>
+                <w:bCs/>
+                <w:color w:val="1A202C"/>
+                <w:sz w:val="20"/>
+                <w:szCs w:val="20"/>
+              </w:rPr>
+              <w:t xml:space="preserve">fn_calcular_mensalidade</w:t>
+            </w:r>
+          </w:p>
+        </w:tc>
+        <w:tc>
+          <w:tcPr>
+            <w:tcBorders>
+              <w:top w:val="single" w:color="E2E8F0" w:sz="4"/>
+              <w:left w:val="single" w:color="E2E8F0" w:sz="4"/>
+              <w:bottom w:val="single" w:color="E2E8F0" w:sz="4"/>
+              <w:right w:val="single" w:color="E2E8F0" w:sz="4"/>
+            </w:tcBorders>
+            <w:shd w:fill="F7FAFC" w:val="clear"/>
+            <w:tcMar>
+              <w:top w:type="dxa" w:w="100"/>
+              <w:left w:type="dxa" w:w="140"/>
+              <w:bottom w:type="dxa" w:w="100"/>
+              <w:right w:type="dxa" w:w="140"/>
+            </w:tcMar>
+            <w:vAlign w:val="center"/>
+          </w:tcPr>
+          <w:p>
+            <w:r>
+              <w:rPr>
+                <w:rFonts w:ascii="Arial" w:cs="Arial" w:eastAsia="Arial" w:hAnsi="Arial"/>
+                <w:b w:val="false"/>
+                <w:bCs w:val="false"/>
+                <w:color w:val="1A202C"/>
+                <w:sz w:val="20"/>
+                <w:szCs w:val="20"/>
+              </w:rPr>
+              <w:t xml:space="preserve">DETERMINISTIC</w:t>
+            </w:r>
+          </w:p>
+        </w:tc>
+        <w:tc>
+          <w:tcPr>
+            <w:tcBorders>
+              <w:top w:val="single" w:color="E2E8F0" w:sz="4"/>
+              <w:left w:val="single" w:color="E2E8F0" w:sz="4"/>
+              <w:bottom w:val="single" w:color="E2E8F0" w:sz="4"/>
+              <w:right w:val="single" w:color="E2E8F0" w:sz="4"/>
+            </w:tcBorders>
+            <w:shd w:fill="F7FAFC" w:val="clear"/>
+            <w:tcMar>
+              <w:top w:type="dxa" w:w="100"/>
+              <w:left w:type="dxa" w:w="140"/>
+              <w:bottom w:type="dxa" w:w="100"/>
+              <w:right w:type="dxa" w:w="140"/>
+            </w:tcMar>
+            <w:vAlign w:val="center"/>
+          </w:tcPr>
+          <w:p>
+            <w:r>
+              <w:rPr>
+                <w:rFonts w:ascii="Arial" w:cs="Arial" w:eastAsia="Arial" w:hAnsi="Arial"/>
+                <w:b w:val="false"/>
+                <w:bCs w:val="false"/>
+                <w:color w:val="1A202C"/>
+                <w:sz w:val="20"/>
+                <w:szCs w:val="20"/>
+              </w:rPr>
+              <w:t xml:space="preserve">READS SQL DATA</w:t>
+            </w:r>
+          </w:p>
+        </w:tc>
+        <w:tc>
+          <w:tcPr>
+            <w:tcBorders>
+              <w:top w:val="single" w:color="E2E8F0" w:sz="4"/>
+              <w:left w:val="single" w:color="E2E8F0" w:sz="4"/>
+              <w:bottom w:val="single" w:color="E2E8F0" w:sz="4"/>
+              <w:right w:val="single" w:color="E2E8F0" w:sz="4"/>
+            </w:tcBorders>
+            <w:shd w:fill="F7FAFC" w:val="clear"/>
+            <w:tcMar>
+              <w:top w:type="dxa" w:w="100"/>
+              <w:left w:type="dxa" w:w="140"/>
+              <w:bottom w:type="dxa" w:w="100"/>
+              <w:right w:type="dxa" w:w="140"/>
+            </w:tcMar>
+            <w:vAlign w:val="center"/>
+          </w:tcPr>
+          <w:p>
+            <w:r>
+              <w:rPr>
+                <w:rFonts w:ascii="Arial" w:cs="Arial" w:eastAsia="Arial" w:hAnsi="Arial"/>
+                <w:b w:val="false"/>
+                <w:bCs w:val="false"/>
+                <w:color w:val="1A202C"/>
+                <w:sz w:val="20"/>
+                <w:szCs w:val="20"/>
+              </w:rPr>
+              <w:t xml:space="preserve">Depende de dados da tabela plano</w:t>
+            </w:r>
+          </w:p>
+        </w:tc>
+      </w:tr>
+    </w:tbl>
+    <w:p>
+      <w:pPr>
+        <w:spacing w:after="0" w:before="120"/>
+      </w:pPr>
+      <w:r>
+        <w:t xml:space="preserve"/>
+      </w:r>
+    </w:p>
+    <w:p>
+      <w:pPr>
+        <w:pStyle w:val="Heading2"/>
+        <w:spacing w:after="160" w:before="380"/>
+      </w:pPr>
+      <w:r>
+        <w:rPr>
+          <w:rFonts w:ascii="Arial" w:cs="Arial" w:eastAsia="Arial" w:hAnsi="Arial"/>
+          <w:b/>
+          <w:bCs/>
+          <w:color w:val="1E6091"/>
+          <w:sz w:val="26"/>
+          <w:szCs w:val="26"/>
+        </w:rPr>
+        <w:t xml:space="preserve">18.6 Correção 6 — sp_ativar_matricula valida o plano</w:t>
+      </w:r>
+    </w:p>
+    <w:tbl>
+      <w:tblPr>
+        <w:tblW w:type="dxa" w:w="9200"/>
+        <w:tblBorders>
+          <w:top w:val="single" w:color="auto" w:sz="4"/>
+          <w:left w:val="single" w:color="auto" w:sz="4"/>
+          <w:bottom w:val="single" w:color="auto" w:sz="4"/>
+          <w:right w:val="single" w:color="auto" w:sz="4"/>
+          <w:insideH w:val="single" w:color="auto" w:sz="4"/>
+          <w:insideV w:val="single" w:color="auto" w:sz="4"/>
+        </w:tblBorders>
+      </w:tblPr>
+      <w:tblGrid>
+        <w:gridCol w:w="9200"/>
+      </w:tblGrid>
+      <w:tr>
+        <w:tc>
+          <w:tcPr>
+            <w:tcBorders>
+              <w:top w:val="single" w:color="2D6A4F" w:sz="6"/>
+              <w:left w:val="single" w:color="2D6A4F" w:sz="6"/>
+              <w:bottom w:val="single" w:color="2D6A4F" w:sz="6"/>
+              <w:right w:val="single" w:color="2D6A4F" w:sz="6"/>
+            </w:tcBorders>
+            <w:shd w:fill="D8F3DC" w:val="clear"/>
+            <w:tcMar>
+              <w:top w:type="dxa" w:w="120"/>
+              <w:left w:type="dxa" w:w="180"/>
+              <w:bottom w:type="dxa" w:w="120"/>
+              <w:right w:type="dxa" w:w="180"/>
+            </w:tcMar>
+          </w:tcPr>
+          <w:p>
+            <w:r>
+              <w:rPr>
+                <w:rFonts w:ascii="Arial" w:cs="Arial" w:eastAsia="Arial" w:hAnsi="Arial"/>
+                <w:b/>
+                <w:bCs/>
+                <w:color w:val="1B4332"/>
+                <w:sz w:val="20"/>
+                <w:szCs w:val="20"/>
+              </w:rPr>
+              <w:t xml:space="preserve">Procedure agora valida se o plano existe e está ativo antes de prosseguir</w:t>
+            </w:r>
+          </w:p>
+        </w:tc>
+      </w:tr>
+    </w:tbl>
+    <w:p>
+      <w:pPr>
+        <w:spacing w:after="0" w:before="80"/>
+      </w:pPr>
+      <w:r>
+        <w:t xml:space="preserve"/>
+      </w:r>
+    </w:p>
+    <w:p>
+      <w:pPr>
+        <w:spacing w:after="100" w:before="60"/>
+      </w:pPr>
+      <w:r>
+        <w:rPr>
+          <w:rFonts w:ascii="Arial" w:cs="Arial" w:eastAsia="Arial" w:hAnsi="Arial"/>
+          <w:color w:val="1A202C"/>
+          <w:sz w:val="22"/>
+          <w:szCs w:val="22"/>
+        </w:rPr>
+        <w:t xml:space="preserve">Problema: se fosse passado um id_plano inexistente ou inativo, a procedure inseria uma matrícula com dados inválidos sem nenhum erro.</w:t>
+      </w:r>
+    </w:p>
+    <w:tbl>
+      <w:tblPr>
+        <w:tblW w:type="dxa" w:w="9200"/>
+        <w:tblBorders>
+          <w:top w:val="single" w:color="auto" w:sz="4"/>
+          <w:left w:val="single" w:color="auto" w:sz="4"/>
+          <w:bottom w:val="single" w:color="auto" w:sz="4"/>
+          <w:right w:val="single" w:color="auto" w:sz="4"/>
+          <w:insideH w:val="single" w:color="auto" w:sz="4"/>
+          <w:insideV w:val="single" w:color="auto" w:sz="4"/>
+        </w:tblBorders>
+      </w:tblPr>
+      <w:tblGrid>
+        <w:gridCol w:w="9200"/>
+      </w:tblGrid>
+      <w:tr>
+        <w:tc>
+          <w:tcPr>
+            <w:tcBorders>
+              <w:top w:val="single" w:color="00B4D8" w:sz="8"/>
+              <w:left w:val="single" w:color="00B4D8" w:sz="24"/>
+              <w:bottom w:val="single" w:color="00B4D8" w:sz="8"/>
+              <w:right w:val="single" w:color="E2E8F0" w:sz="4"/>
+            </w:tcBorders>
+            <w:shd w:fill="0D1B2A" w:val="clear"/>
+            <w:tcMar>
+              <w:top w:type="dxa" w:w="140"/>
+              <w:left w:type="dxa" w:w="200"/>
+              <w:bottom w:type="dxa" w:w="140"/>
+              <w:right w:type="dxa" w:w="200"/>
+            </w:tcMar>
+          </w:tcPr>
+          <w:p>
+            <w:pPr>
+              <w:spacing w:after="0" w:before="0"/>
+            </w:pPr>
+            <w:r>
+              <w:rPr>
+                <w:rFonts w:ascii="Courier New" w:cs="Courier New" w:eastAsia="Courier New" w:hAnsi="Courier New"/>
+                <w:color w:val="90E0EF"/>
+                <w:sz w:val="17"/>
+                <w:szCs w:val="17"/>
+              </w:rPr>
+              <w:t xml:space="preserve">-- ADICIONADO no início de sp_ativar_matricula:</w:t>
+            </w:r>
+          </w:p>
+          <w:p>
+            <w:pPr>
+              <w:spacing w:after="0" w:before="0"/>
+            </w:pPr>
+            <w:r>
+              <w:rPr>
+                <w:rFonts w:ascii="Courier New" w:cs="Courier New" w:eastAsia="Courier New" w:hAnsi="Courier New"/>
+                <w:color w:val="90E0EF"/>
+                <w:sz w:val="17"/>
+                <w:szCs w:val="17"/>
+              </w:rPr>
+              <w:t xml:space="preserve">SELECT COUNT(*) INTO v_plano_existe FROM plano</w:t>
+            </w:r>
+          </w:p>
+          <w:p>
+            <w:pPr>
+              <w:spacing w:after="0" w:before="0"/>
+            </w:pPr>
+            <w:r>
+              <w:rPr>
+                <w:rFonts w:ascii="Courier New" w:cs="Courier New" w:eastAsia="Courier New" w:hAnsi="Courier New"/>
+                <w:color w:val="90E0EF"/>
+                <w:sz w:val="17"/>
+                <w:szCs w:val="17"/>
+              </w:rPr>
+              <w:t xml:space="preserve">WHERE id_plano = p_id_plano AND ativo = 1;</w:t>
+            </w:r>
+          </w:p>
+          <w:p>
+            <w:pPr>
+              <w:spacing w:after="0" w:before="0"/>
+            </w:pPr>
+            <w:r>
+              <w:rPr>
+                <w:rFonts w:ascii="Courier New" w:cs="Courier New" w:eastAsia="Courier New" w:hAnsi="Courier New"/>
+                <w:color w:val="90E0EF"/>
+                <w:sz w:val="17"/>
+                <w:szCs w:val="17"/>
+              </w:rPr>
+              <w:t xml:space="preserve">IF v_plano_existe = 0 THEN</w:t>
+            </w:r>
+          </w:p>
+          <w:p>
+            <w:pPr>
+              <w:spacing w:after="0" w:before="0"/>
+            </w:pPr>
+            <w:r>
+              <w:rPr>
+                <w:rFonts w:ascii="Courier New" w:cs="Courier New" w:eastAsia="Courier New" w:hAnsi="Courier New"/>
+                <w:color w:val="90E0EF"/>
+                <w:sz w:val="17"/>
+                <w:szCs w:val="17"/>
+              </w:rPr>
+              <w:t xml:space="preserve">    SIGNAL SQLSTATE '45000'</w:t>
+            </w:r>
+          </w:p>
+          <w:p>
+            <w:pPr>
+              <w:spacing w:after="0" w:before="0"/>
+            </w:pPr>
+            <w:r>
+              <w:rPr>
+                <w:rFonts w:ascii="Courier New" w:cs="Courier New" w:eastAsia="Courier New" w:hAnsi="Courier New"/>
+                <w:color w:val="90E0EF"/>
+                <w:sz w:val="17"/>
+                <w:szCs w:val="17"/>
+              </w:rPr>
+              <w:t xml:space="preserve">    SET MESSAGE_TEXT = 'Plano não encontrado ou inativo.';</w:t>
+            </w:r>
+          </w:p>
+          <w:p>
+            <w:pPr>
+              <w:spacing w:after="0" w:before="0"/>
+            </w:pPr>
+            <w:r>
+              <w:rPr>
+                <w:rFonts w:ascii="Courier New" w:cs="Courier New" w:eastAsia="Courier New" w:hAnsi="Courier New"/>
+                <w:color w:val="90E0EF"/>
+                <w:sz w:val="17"/>
+                <w:szCs w:val="17"/>
+              </w:rPr>
+              <w:t xml:space="preserve">END IF;</w:t>
+            </w:r>
+          </w:p>
+        </w:tc>
+      </w:tr>
+    </w:tbl>
+    <w:p>
+      <w:pPr>
+        <w:spacing w:after="0" w:before="80"/>
+      </w:pPr>
+      <w:r>
+        <w:t xml:space="preserve"/>
+      </w:r>
+    </w:p>
+    <w:p>
+      <w:pPr>
+        <w:pStyle w:val="Heading1"/>
+        <w:pBdr>
+          <w:bottom w:val="single" w:color="00B4D8" w:sz="16" w:space="8"/>
+        </w:pBdr>
+        <w:spacing w:after="240" w:before="560"/>
+      </w:pPr>
+      <w:r>
+        <w:rPr>
+          <w:rFonts w:ascii="Arial" w:cs="Arial" w:eastAsia="Arial" w:hAnsi="Arial"/>
+          <w:b/>
+          <w:bCs/>
+          <w:color w:val="0D1B2A"/>
+          <w:sz w:val="34"/>
+          <w:szCs w:val="34"/>
+        </w:rPr>
+        <w:t xml:space="preserve">19. Estrutura do Projeto</w:t>
       </w:r>
     </w:p>
     <w:p>
@@ -45027,7 +47001,7 @@
           <w:sz w:val="34"/>
           <w:szCs w:val="34"/>
         </w:rPr>
-        <w:t xml:space="preserve">19. Conclusão</w:t>
+        <w:t xml:space="preserve">20. Conclusão</w:t>
       </w:r>
     </w:p>
     <w:tbl>

</xml_diff>